<commit_message>
change question file name
</commit_message>
<xml_diff>
--- a/MS_P3_MehradZeidi.docx
+++ b/MS_P3_MehradZeidi.docx
@@ -9974,21 +9974,7 @@
         <w:rPr>
           <w:rtl/>
         </w:rPr>
-        <w:t xml:space="preserve"> عنوان </w:t>
-      </w:r>
-      <w:proofErr w:type="spellStart"/>
-      <w:r>
-        <w:rPr>
-          <w:rtl/>
-        </w:rPr>
-        <w:t>کارآمدترین</w:t>
-      </w:r>
-      <w:proofErr w:type="spellEnd"/>
-      <w:r>
-        <w:rPr>
-          <w:rtl/>
-        </w:rPr>
-        <w:t xml:space="preserve"> روش شناخته می‌شود</w:t>
+        <w:t xml:space="preserve"> عنوان کارآمدترین روش شناخته می‌شود</w:t>
       </w:r>
       <w:r>
         <w:t>.</w:t>
@@ -11146,13 +11132,25 @@
       </w:r>
       <w:proofErr w:type="spellEnd"/>
       <w:r>
-        <w:t xml:space="preserve"> s0</w:t>
+        <w:t xml:space="preserve"> </w:t>
+      </w:r>
+      <w:r>
+        <w:t>Q</w:t>
+      </w:r>
+      <w:r>
+        <w:t>0</w:t>
       </w:r>
       <w:r>
         <w:t>2</w:t>
       </w:r>
       <w:r>
-        <w:t>.ipynb، s0</w:t>
+        <w:t xml:space="preserve">.ipynb، </w:t>
+      </w:r>
+      <w:r>
+        <w:t>Q</w:t>
+      </w:r>
+      <w:r>
+        <w:t>0</w:t>
       </w:r>
       <w:r>
         <w:t>1</w:t>
@@ -11160,25 +11158,41 @@
       <w:r>
         <w:t xml:space="preserve">.ipynb </w:t>
       </w:r>
+      <w:r>
+        <w:rPr>
+          <w:rtl/>
+        </w:rPr>
+        <w:t>و</w:t>
+      </w:r>
+      <w:r>
+        <w:t xml:space="preserve"> </w:t>
+      </w:r>
       <w:proofErr w:type="gramStart"/>
       <w:r>
-        <w:rPr>
-          <w:rtl/>
-        </w:rPr>
-        <w:t>و</w:t>
-      </w:r>
-      <w:r>
-        <w:t xml:space="preserve"> s03</w:t>
+        <w:t>Q</w:t>
+      </w:r>
+      <w:r>
+        <w:t xml:space="preserve">03.ipynb </w:t>
+      </w:r>
+      <w:r>
+        <w:rPr>
+          <w:rFonts w:hint="cs"/>
+          <w:rtl/>
+        </w:rPr>
+        <w:t xml:space="preserve"> </w:t>
+      </w:r>
+      <w:r>
+        <w:rPr>
+          <w:rtl/>
+        </w:rPr>
+        <w:t>ثبت</w:t>
       </w:r>
       <w:proofErr w:type="gramEnd"/>
       <w:r>
-        <w:t xml:space="preserve">.ipynb </w:t>
-      </w:r>
-      <w:r>
-        <w:rPr>
-          <w:rtl/>
-        </w:rPr>
-        <w:t xml:space="preserve">ثبت </w:t>
+        <w:rPr>
+          <w:rtl/>
+        </w:rPr>
+        <w:t xml:space="preserve"> </w:t>
       </w:r>
       <w:proofErr w:type="gramStart"/>
       <w:r>

</xml_diff>